<commit_message>
Ship current resume files in Pages build (public/ copy had gone stale)
</commit_message>
<xml_diff>
--- a/public/Paul-Romeo-Resume.docx
+++ b/public/Paul-Romeo-Resume.docx
@@ -279,7 +279,7 @@
         <w:rPr>
           <w:sz w:val="19"/>
         </w:rPr>
-        <w:t>Systems Administrator &amp; Security Administrator</w:t>
+        <w:t>IT &amp; Security Administrator</w:t>
       </w:r>
       <w:r>
         <w:rPr>
@@ -511,7 +511,7 @@
         <w:rPr>
           <w:sz w:val="19"/>
         </w:rPr>
-        <w:t>Identified and dismantled a network of 15 fraudulent websites and 5 payment processors impersonating real small businesses.</w:t>
+        <w:t>Identified a network of 14 fraudulent websites and 8 payment processors impersonating real small businesses.</w:t>
       </w:r>
     </w:p>
     <w:p>
@@ -523,7 +523,7 @@
         <w:rPr>
           <w:sz w:val="19"/>
         </w:rPr>
-        <w:t>Traced the full operation to a single threat actor using WHOIS data, Burp Suite, DNS analysis, and a shared admin handle found in page source.</w:t>
+        <w:t>Traced the operation to a single threat actor using WHOIS data, Burp Suite, DNS analysis, and a shared admin handle found in page source.</w:t>
       </w:r>
     </w:p>
     <w:p>
@@ -535,7 +535,7 @@
         <w:rPr>
           <w:sz w:val="19"/>
         </w:rPr>
-        <w:t>Filed coordinated takedowns that took down the entire operation.</w:t>
+        <w:t>Reported the full network to registrars, the FTC (confirmed, control on file), and Google Ads/Maps with evidence; corrections filed and takedowns in progress. Public case file: fakeboot.paulromeo.net.</w:t>
       </w:r>
     </w:p>
     <w:p>

</xml_diff>

<commit_message>
Publish realistic resume with current site copy
</commit_message>
<xml_diff>
--- a/public/Paul-Romeo-Resume.docx
+++ b/public/Paul-Romeo-Resume.docx
@@ -5,578 +5,594 @@
     <w:p>
       <w:pPr>
         <w:pStyle w:val="NameTitle"/>
-        <w:spacing w:before="0" w:after="40" w:line="240" w:lineRule="auto"/>
+        <w:spacing w:after="20"/>
       </w:pPr>
       <w:r>
-        <w:rPr>
-          <w:sz w:val="36"/>
-        </w:rPr>
+        <w:rPr/>
         <w:t>PAUL J. ROMEO</w:t>
       </w:r>
     </w:p>
     <w:p>
       <w:pPr>
         <w:pStyle w:val="ContactLine"/>
-        <w:spacing w:before="0" w:after="40" w:line="230" w:lineRule="exact"/>
+        <w:spacing w:after="100"/>
       </w:pPr>
       <w:r>
-        <w:rPr>
-          <w:sz w:val="19"/>
-        </w:rPr>
-        <w:t>Union, NJ  |  pauljromeo@proton.me  |  linkedin.com/in/paul-romeo  |  github.com/p-romeo</w:t>
+        <w:rPr/>
+        <w:t>Union, NJ  |  201-918-0519  |  paul@paulromeo.net  |  linkedin.com/in/paul-romeo  |  github.com/p-romeo</w:t>
       </w:r>
     </w:p>
     <w:p>
       <w:pPr>
         <w:pStyle w:val="SectionHeader"/>
-        <w:spacing w:before="120" w:after="40" w:line="260" w:lineRule="exact"/>
+        <w:keepNext/>
+        <w:spacing w:before="120" w:after="50"/>
+        <w:pBdr>
+          <w:bottom w:val="single" w:sz="6" w:space="2" w:color="B0B7C3"/>
+        </w:pBdr>
       </w:pPr>
       <w:r>
-        <w:rPr>
-          <w:sz w:val="22"/>
-        </w:rPr>
+        <w:rPr/>
         <w:t>SUMMARY</w:t>
       </w:r>
     </w:p>
     <w:p>
       <w:pPr>
         <w:pStyle w:val="Body"/>
-        <w:spacing w:before="0" w:after="40" w:line="230" w:lineRule="exact"/>
+        <w:spacing w:after="50"/>
       </w:pPr>
       <w:r>
-        <w:rPr>
-          <w:sz w:val="19"/>
-        </w:rPr>
-        <w:t>Security-focused IT professional who owns security and IT operations end-to-end for a multi-channel e-commerce company. Leads incident response and phishing/BEC investigations through to attacker-infrastructure takedowns; administers ESET EDR, UniFi networking and Protect surveillance, and TrueNAS storage. B.S. in Cybersecurity &amp; Information Assurance (WGU, August 2026) backed by nine industry certifications including Security+, CySA+, PenTest+, and ISC2 SSCP.</w:t>
+        <w:rPr/>
+        <w:t>Security-focused IT and online stores professional supporting a four-person business. Administers ESET endpoint and email protections, UniFi networking, and TrueNAS storage while managing BigCommerce operations. B.S. in Cybersecurity &amp; Information Assurance (WGU, August 2026); Wazuh SIEM capstone and independent OSINT casework support a move into security analysis.</w:t>
       </w:r>
     </w:p>
     <w:p>
       <w:pPr>
         <w:pStyle w:val="SectionHeader"/>
-        <w:spacing w:before="120" w:after="40" w:line="260" w:lineRule="exact"/>
+        <w:keepNext/>
+        <w:spacing w:before="120" w:after="50"/>
+        <w:pBdr>
+          <w:bottom w:val="single" w:sz="6" w:space="2" w:color="B0B7C3"/>
+        </w:pBdr>
       </w:pPr>
       <w:r>
-        <w:rPr>
-          <w:sz w:val="22"/>
-        </w:rPr>
+        <w:rPr/>
         <w:t>CORE SKILLS</w:t>
       </w:r>
     </w:p>
     <w:p>
       <w:pPr>
         <w:pStyle w:val="Body"/>
-        <w:spacing w:before="0" w:after="40" w:line="230" w:lineRule="exact"/>
+        <w:spacing w:after="50"/>
       </w:pPr>
       <w:r>
         <w:rPr>
           <w:b/>
-          <w:sz w:val="19"/>
         </w:rPr>
-        <w:t xml:space="preserve">Security Operations: </w:t>
+        <w:t xml:space="preserve">Endpoint &amp; Email Security: </w:t>
       </w:r>
       <w:r>
-        <w:rPr>
-          <w:sz w:val="19"/>
-        </w:rPr>
-        <w:t>EDR Administration (ESET EDR / Cloud Protect) | Phishing &amp; BEC Investigation | Attacker-Infrastructure Takedowns | Log Analysis | Wazuh SIEM | Duo MFA | Vulnerability Management | Endpoint Hardening | Patch Management</w:t>
+        <w:rPr/>
+        <w:t>ESET EDR / Cloud Protect | Endpoint Security Checks | Phishing Defense | Windows Endpoint Maintenance</w:t>
       </w:r>
     </w:p>
     <w:p>
       <w:pPr>
         <w:pStyle w:val="Body"/>
-        <w:spacing w:before="0" w:after="40" w:line="230" w:lineRule="exact"/>
+        <w:spacing w:after="50"/>
       </w:pPr>
       <w:r>
         <w:rPr>
           <w:b/>
-          <w:sz w:val="19"/>
         </w:rPr>
         <w:t xml:space="preserve">Network &amp; Infrastructure: </w:t>
       </w:r>
       <w:r>
-        <w:rPr>
-          <w:sz w:val="19"/>
-        </w:rPr>
-        <w:t>UniFi Networking | VLANs &amp; Segmentation | TCP/IP, DNS, Wi-Fi | TrueNAS / SMB Storage | Backup &amp; Disaster Recovery | Windows &amp; Active Directory</w:t>
+        <w:rPr/>
+        <w:t>UniFi Networking | VLAN Segmentation | UniFi Protect | TrueNAS / SMB | Backups | TCP/IP | DNS</w:t>
       </w:r>
     </w:p>
     <w:p>
       <w:pPr>
         <w:pStyle w:val="Body"/>
-        <w:spacing w:before="0" w:after="40" w:line="230" w:lineRule="exact"/>
+        <w:spacing w:after="50"/>
       </w:pPr>
       <w:r>
         <w:rPr>
           <w:b/>
-          <w:sz w:val="19"/>
         </w:rPr>
-        <w:t xml:space="preserve">Automation &amp; Tools: </w:t>
+        <w:t xml:space="preserve">Investigation &amp; Tools: </w:t>
       </w:r>
       <w:r>
-        <w:rPr>
-          <w:sz w:val="19"/>
-        </w:rPr>
-        <w:t>Python | PowerShell | Bash | Git | GitHub Actions CI/CD</w:t>
+        <w:rPr/>
+        <w:t>Wazuh SIEM (WGU capstone) | Log Analysis (coursework/labs) | OSINT | Python | PowerShell | Bash</w:t>
       </w:r>
     </w:p>
     <w:p>
       <w:pPr>
         <w:pStyle w:val="Body"/>
-        <w:spacing w:before="0" w:after="40" w:line="230" w:lineRule="exact"/>
+        <w:spacing w:after="50"/>
       </w:pPr>
       <w:r>
         <w:rPr>
           <w:b/>
-          <w:sz w:val="19"/>
         </w:rPr>
         <w:t xml:space="preserve">Business Platforms: </w:t>
       </w:r>
       <w:r>
-        <w:rPr>
-          <w:sz w:val="19"/>
-        </w:rPr>
-        <w:t>BigCommerce | Amazon FBA | eBay | POS Integration</w:t>
+        <w:rPr/>
+        <w:t>BigCommerce | POS Integration | Amazon FBA | eBay</w:t>
       </w:r>
     </w:p>
     <w:p>
       <w:pPr>
         <w:pStyle w:val="SectionHeader"/>
-        <w:spacing w:before="120" w:after="40" w:line="260" w:lineRule="exact"/>
+        <w:keepNext/>
+        <w:spacing w:before="120" w:after="50"/>
+        <w:pBdr>
+          <w:bottom w:val="single" w:sz="6" w:space="2" w:color="B0B7C3"/>
+        </w:pBdr>
       </w:pPr>
       <w:r>
-        <w:rPr>
-          <w:sz w:val="22"/>
-        </w:rPr>
+        <w:rPr/>
         <w:t>CERTIFICATIONS</w:t>
       </w:r>
     </w:p>
     <w:p>
       <w:pPr>
         <w:pStyle w:val="ListBullet"/>
-        <w:spacing w:before="0" w:after="20" w:line="230" w:lineRule="exact"/>
+        <w:spacing w:after="30"/>
+        <w:ind w:left="288" w:hanging="187"/>
       </w:pPr>
       <w:r>
-        <w:rPr>
-          <w:sz w:val="19"/>
-        </w:rPr>
-        <w:t>CompTIA PenTest+ (PT0-003) — ID e3a26d1b0a1944db8e569cfa0ce20432 (Apr 2026 - Apr 2029)</w:t>
+        <w:rPr/>
+        <w:t>CompTIA PenTest+ (PT0-003) (Apr 2026 - Apr 2029)</w:t>
       </w:r>
     </w:p>
     <w:p>
       <w:pPr>
         <w:pStyle w:val="ListBullet"/>
-        <w:spacing w:before="0" w:after="20" w:line="230" w:lineRule="exact"/>
+        <w:spacing w:after="30"/>
+        <w:ind w:left="288" w:hanging="187"/>
       </w:pPr>
       <w:r>
-        <w:rPr>
-          <w:sz w:val="19"/>
-        </w:rPr>
-        <w:t>CompTIA CySA+ — ID RWEXWLLS9NRE5JE2 (Aug 2025 - Aug 2028)</w:t>
+        <w:rPr/>
+        <w:t>CompTIA CySA+ (Aug 2025 - Aug 2028)</w:t>
       </w:r>
     </w:p>
     <w:p>
       <w:pPr>
         <w:pStyle w:val="ListBullet"/>
-        <w:spacing w:before="0" w:after="20" w:line="230" w:lineRule="exact"/>
+        <w:spacing w:after="30"/>
+        <w:ind w:left="288" w:hanging="187"/>
       </w:pPr>
       <w:r>
-        <w:rPr>
-          <w:sz w:val="19"/>
-        </w:rPr>
-        <w:t>ISC2 SSCP — ID 1123939 (Jul 2025)</w:t>
+        <w:rPr/>
+        <w:t>ISC2 SSCP (Jul 2025)</w:t>
       </w:r>
     </w:p>
     <w:p>
       <w:pPr>
         <w:pStyle w:val="ListBullet"/>
-        <w:spacing w:before="0" w:after="20" w:line="230" w:lineRule="exact"/>
+        <w:spacing w:after="30"/>
+        <w:ind w:left="288" w:hanging="187"/>
       </w:pPr>
       <w:r>
-        <w:rPr>
-          <w:sz w:val="19"/>
-        </w:rPr>
-        <w:t>CompTIA Project+ — ID K1MYZLGS02V415QJ (Jul 2025)</w:t>
+        <w:rPr/>
+        <w:t>CompTIA Project+ (Jul 2025)</w:t>
       </w:r>
     </w:p>
     <w:p>
       <w:pPr>
         <w:pStyle w:val="ListBullet"/>
-        <w:spacing w:before="0" w:after="20" w:line="230" w:lineRule="exact"/>
+        <w:spacing w:after="30"/>
+        <w:ind w:left="288" w:hanging="187"/>
       </w:pPr>
       <w:r>
-        <w:rPr>
-          <w:sz w:val="19"/>
-        </w:rPr>
-        <w:t>LPI Linux Essentials — ID LPI000661841 (Aug 2025)</w:t>
+        <w:rPr/>
+        <w:t>LPI Linux Essentials (Aug 2025)</w:t>
       </w:r>
     </w:p>
     <w:p>
       <w:pPr>
         <w:pStyle w:val="ListBullet"/>
-        <w:spacing w:before="0" w:after="20" w:line="230" w:lineRule="exact"/>
+        <w:spacing w:after="30"/>
+        <w:ind w:left="288" w:hanging="187"/>
       </w:pPr>
       <w:r>
-        <w:rPr>
-          <w:sz w:val="19"/>
-        </w:rPr>
-        <w:t>CompTIA Security+ — ID 2SY3TK06GJ44Q4WQ (Jul 2024 - Jul 2027)</w:t>
+        <w:rPr/>
+        <w:t>CompTIA Security+ (Jul 2024 - Jul 2027)</w:t>
       </w:r>
     </w:p>
     <w:p>
       <w:pPr>
         <w:pStyle w:val="ListBullet"/>
-        <w:spacing w:before="0" w:after="20" w:line="230" w:lineRule="exact"/>
+        <w:spacing w:after="30"/>
+        <w:ind w:left="288" w:hanging="187"/>
       </w:pPr>
       <w:r>
-        <w:rPr>
-          <w:sz w:val="19"/>
-        </w:rPr>
-        <w:t>CompTIA Network+ — ID N0BPXTXZFFV4QM3T (Jun 2024 - Jun 2027)</w:t>
+        <w:rPr/>
+        <w:t>CompTIA Network+ (Jun 2024 - Jun 2027)</w:t>
       </w:r>
     </w:p>
     <w:p>
       <w:pPr>
         <w:pStyle w:val="ListBullet"/>
-        <w:spacing w:before="0" w:after="20" w:line="230" w:lineRule="exact"/>
+        <w:spacing w:after="30"/>
+        <w:ind w:left="288" w:hanging="187"/>
       </w:pPr>
       <w:r>
-        <w:rPr>
-          <w:sz w:val="19"/>
-        </w:rPr>
-        <w:t>CompTIA A+ — ID G33N7H5ZJERE1F5W (Jun 2024 - Jun 2027)</w:t>
+        <w:rPr/>
+        <w:t>CompTIA A+ (Jun 2024 - Jun 2027)</w:t>
       </w:r>
     </w:p>
     <w:p>
       <w:pPr>
         <w:pStyle w:val="ListBullet"/>
-        <w:spacing w:before="0" w:after="20" w:line="230" w:lineRule="exact"/>
+        <w:spacing w:after="30"/>
+        <w:ind w:left="288" w:hanging="187"/>
       </w:pPr>
       <w:r>
-        <w:rPr>
-          <w:sz w:val="19"/>
-        </w:rPr>
-        <w:t>ITIL 4 Foundation — ID GR671719240PR (Dec 2024 - Dec 2027)</w:t>
+        <w:rPr/>
+        <w:t>ITIL 4 Foundation (Dec 2024 - Dec 2027)</w:t>
       </w:r>
     </w:p>
     <w:p>
       <w:pPr>
         <w:pStyle w:val="SectionHeader"/>
-        <w:spacing w:before="120" w:after="40" w:line="260" w:lineRule="exact"/>
+        <w:keepNext/>
+        <w:spacing w:before="120" w:after="50"/>
+        <w:pBdr>
+          <w:bottom w:val="single" w:sz="6" w:space="2" w:color="B0B7C3"/>
+        </w:pBdr>
       </w:pPr>
       <w:r>
-        <w:rPr>
-          <w:sz w:val="22"/>
-        </w:rPr>
+        <w:rPr/>
         <w:t>PROFESSIONAL EXPERIENCE</w:t>
       </w:r>
     </w:p>
     <w:p>
       <w:pPr>
         <w:pStyle w:val="JobTitle"/>
-        <w:spacing w:before="0" w:after="40" w:line="230" w:lineRule="exact"/>
+        <w:spacing/>
       </w:pPr>
       <w:r>
-        <w:rPr>
-          <w:sz w:val="19"/>
-        </w:rPr>
-        <w:t>IT &amp; Security Administrator</w:t>
+        <w:rPr/>
+        <w:t>Online Stores &amp; IT</w:t>
       </w:r>
       <w:r>
-        <w:rPr>
-          <w:sz w:val="19"/>
-        </w:rPr>
-        <w:t xml:space="preserve"> — Belmont Leather Company</w:t>
+        <w:rPr/>
+        <w:t xml:space="preserve"> | Belmont Leather Company</w:t>
       </w:r>
     </w:p>
     <w:p>
       <w:pPr>
         <w:pStyle w:val="JobMeta"/>
-        <w:spacing w:before="0" w:after="40" w:line="230" w:lineRule="exact"/>
+        <w:spacing w:after="30"/>
       </w:pPr>
       <w:r>
-        <w:rPr>
-          <w:sz w:val="19"/>
-        </w:rPr>
+        <w:rPr/>
         <w:t>Clifton, NJ  |  2021 - Present</w:t>
       </w:r>
     </w:p>
     <w:p>
       <w:pPr>
         <w:pStyle w:val="ListBullet"/>
-        <w:spacing w:before="0" w:after="20" w:line="230" w:lineRule="exact"/>
+        <w:spacing w:after="30"/>
+        <w:ind w:left="288" w:hanging="187"/>
       </w:pPr>
       <w:r>
-        <w:rPr>
-          <w:sz w:val="19"/>
-        </w:rPr>
-        <w:t>Own security and IT operations end-to-end as the company's sole internal administrator: workstations, printers, network devices, storage, and backups.</w:t>
+        <w:rPr/>
+        <w:t>Support day-to-day IT for a four-person business, including Windows workstations, printers, network devices, and endpoint troubleshooting.</w:t>
       </w:r>
     </w:p>
     <w:p>
       <w:pPr>
         <w:pStyle w:val="ListBullet"/>
-        <w:spacing w:before="0" w:after="20" w:line="230" w:lineRule="exact"/>
+        <w:spacing w:after="30"/>
+        <w:ind w:left="288" w:hanging="187"/>
       </w:pPr>
       <w:r>
-        <w:rPr>
-          <w:sz w:val="19"/>
-        </w:rPr>
-        <w:t>Administer ESET EDR and ESET Cloud Protect across ~15 endpoints; built automated threat alerting, weekly CVE exposure reviews, and endpoint update management.</w:t>
+        <w:rPr/>
+        <w:t>Administer ESET EDR and ESET Cloud Protect across approximately 15 endpoints; check endpoint security status and manage updates.</w:t>
       </w:r>
     </w:p>
     <w:p>
       <w:pPr>
         <w:pStyle w:val="ListBullet"/>
-        <w:spacing w:before="0" w:after="20" w:line="230" w:lineRule="exact"/>
+        <w:spacing w:after="30"/>
+        <w:ind w:left="288" w:hanging="187"/>
       </w:pPr>
       <w:r>
         <w:rPr>
-          <w:sz w:val="19"/>
+          <w:b w:val="0"/>
         </w:rPr>
-        <w:t>Lead phishing and BEC incident response end-to-end, filing registrar/host/abuse-desk takedowns against live campaigns (ClickFix malware lures, BEC impersonation attempts, SSA/ScreenConnect lures, and brand-impersonation waves).</w:t>
+        <w:t>Maintain email filtering and phishing defenses through ESET Cloud Protect; review suspicious messages and report or block them.</w:t>
       </w:r>
     </w:p>
     <w:p>
       <w:pPr>
         <w:pStyle w:val="ListBullet"/>
-        <w:spacing w:before="0" w:after="20" w:line="230" w:lineRule="exact"/>
+        <w:spacing w:after="30"/>
+        <w:ind w:left="288" w:hanging="187"/>
       </w:pPr>
       <w:r>
-        <w:rPr>
-          <w:sz w:val="19"/>
-        </w:rPr>
-        <w:t>Designed and deployed core infrastructure: a UniFi network with VLAN segmentation, a 10-camera UniFi Protect surveillance system, and TrueNAS storage with SMB shares and scheduled cloud backup.</w:t>
+        <w:rPr/>
+        <w:t>Maintain UniFi networking and VLAN segmentation, a 10-camera UniFi Protect system, and TrueNAS SMB storage with scheduled cloud backups.</w:t>
       </w:r>
     </w:p>
     <w:p>
       <w:pPr>
         <w:pStyle w:val="ListBullet"/>
-        <w:spacing w:before="0" w:after="20" w:line="230" w:lineRule="exact"/>
+        <w:spacing w:after="30"/>
+        <w:ind w:left="288" w:hanging="187"/>
       </w:pPr>
       <w:r>
-        <w:rPr>
-          <w:sz w:val="19"/>
-        </w:rPr>
-        <w:t>Drove e-commerce growth on BigCommerce integrated with point-of-sale: 389% sales growth and $1.2M in new revenue; cut $12K in costs through POS/e-commerce integration and added $32K/year via customer-relationship systems.</w:t>
+        <w:rPr/>
+        <w:t>Manage BigCommerce storefront operations and POS integration alongside IT support.</w:t>
       </w:r>
     </w:p>
     <w:p>
       <w:pPr>
         <w:pStyle w:val="JobTitle"/>
-        <w:spacing w:before="0" w:after="40" w:line="230" w:lineRule="exact"/>
+        <w:spacing/>
       </w:pPr>
       <w:r>
-        <w:rPr>
-          <w:sz w:val="19"/>
-        </w:rPr>
+        <w:rPr/>
         <w:t>Theater Technician (Part-time)</w:t>
       </w:r>
       <w:r>
-        <w:rPr>
-          <w:sz w:val="19"/>
-        </w:rPr>
-        <w:t xml:space="preserve"> — Rowan University</w:t>
+        <w:rPr/>
+        <w:t xml:space="preserve"> | Rowan University</w:t>
       </w:r>
     </w:p>
     <w:p>
       <w:pPr>
         <w:pStyle w:val="JobMeta"/>
-        <w:spacing w:before="0" w:after="20" w:line="220" w:lineRule="exact"/>
+        <w:spacing w:after="30"/>
       </w:pPr>
       <w:r>
-        <w:rPr>
-          <w:sz w:val="19"/>
-        </w:rPr>
+        <w:rPr/>
         <w:t>2018 - 2020</w:t>
       </w:r>
     </w:p>
     <w:p>
       <w:pPr>
         <w:pStyle w:val="ListBullet"/>
-        <w:spacing w:before="0" w:after="20" w:line="230" w:lineRule="exact"/>
+        <w:spacing w:after="30"/>
+        <w:ind w:left="288" w:hanging="187"/>
       </w:pPr>
       <w:r>
-        <w:rPr>
-          <w:sz w:val="19"/>
-        </w:rPr>
-        <w:t>Operated and maintained lighting, sound, and life-safety systems across 20+ live productions, troubleshooting failures under show-time pressure.</w:t>
+        <w:rPr/>
+        <w:t>Operated and maintained lighting, sound, and life-safety systems for live productions, troubleshooting failures during events.</w:t>
       </w:r>
     </w:p>
     <w:p>
       <w:pPr>
         <w:pStyle w:val="ListBullet"/>
-        <w:spacing w:before="0" w:after="20" w:line="230" w:lineRule="exact"/>
+        <w:spacing w:after="30"/>
+        <w:ind w:left="288" w:hanging="187"/>
       </w:pPr>
       <w:r>
-        <w:rPr>
-          <w:sz w:val="19"/>
-        </w:rPr>
+        <w:rPr/>
         <w:t>Coordinated setup and teardown with student and faculty crews for rehearsals, performances, and campus events.</w:t>
       </w:r>
     </w:p>
     <w:p>
       <w:pPr>
         <w:pStyle w:val="JobTitle"/>
-        <w:spacing w:before="0" w:after="40" w:line="230" w:lineRule="exact"/>
+        <w:spacing/>
       </w:pPr>
       <w:r>
-        <w:rPr>
-          <w:sz w:val="19"/>
-        </w:rPr>
+        <w:rPr/>
         <w:t>IT Help Desk Technician &amp; Media Services Specialist</w:t>
       </w:r>
       <w:r>
-        <w:rPr>
-          <w:sz w:val="19"/>
-        </w:rPr>
-        <w:t xml:space="preserve"> — Southern New Hampshire University</w:t>
+        <w:rPr/>
+        <w:t xml:space="preserve"> | Southern New Hampshire University</w:t>
       </w:r>
     </w:p>
     <w:p>
       <w:pPr>
         <w:pStyle w:val="JobMeta"/>
-        <w:spacing w:before="0" w:after="20" w:line="220" w:lineRule="exact"/>
+        <w:spacing w:after="30"/>
       </w:pPr>
       <w:r>
-        <w:rPr>
-          <w:sz w:val="19"/>
-        </w:rPr>
+        <w:rPr/>
         <w:t>2016 - 2018</w:t>
       </w:r>
     </w:p>
     <w:p>
       <w:pPr>
         <w:pStyle w:val="ListBullet"/>
-        <w:spacing w:before="0" w:after="20" w:line="230" w:lineRule="exact"/>
+        <w:spacing w:after="30"/>
+        <w:ind w:left="288" w:hanging="187"/>
       </w:pPr>
       <w:r>
-        <w:rPr>
-          <w:sz w:val="19"/>
-        </w:rPr>
-        <w:t>Delivered Tier 1/2 support to 200+ users: malware removal, security policy enforcement, hardware/software triage, and account administration.</w:t>
+        <w:rPr/>
+        <w:t>Provided Tier 1/2 help desk support, troubleshooting hardware, software, accounts, and malware issues.</w:t>
       </w:r>
     </w:p>
     <w:p>
       <w:pPr>
         <w:pStyle w:val="ListBullet"/>
-        <w:spacing w:before="0" w:after="20" w:line="230" w:lineRule="exact"/>
+        <w:spacing w:after="30"/>
+        <w:ind w:left="288" w:hanging="187"/>
       </w:pPr>
       <w:r>
-        <w:rPr>
-          <w:sz w:val="19"/>
-        </w:rPr>
-        <w:t>Maintained classroom and AV technology across campus, supporting lectures, media playback, and hybrid events.</w:t>
+        <w:rPr/>
+        <w:t>Maintained classroom and AV technology across campus for lectures, media playback, and events.</w:t>
       </w:r>
     </w:p>
     <w:p>
       <w:pPr>
         <w:pStyle w:val="SectionHeader"/>
-        <w:spacing w:before="120" w:after="40" w:line="260" w:lineRule="exact"/>
+        <w:keepNext/>
+        <w:spacing w:before="120" w:after="50"/>
+        <w:pBdr>
+          <w:bottom w:val="single" w:sz="6" w:space="2" w:color="B0B7C3"/>
+        </w:pBdr>
       </w:pPr>
       <w:r>
-        <w:rPr>
-          <w:sz w:val="22"/>
-        </w:rPr>
+        <w:rPr/>
         <w:t>PROJECTS</w:t>
       </w:r>
     </w:p>
     <w:p>
       <w:pPr>
-        <w:spacing w:before="0" w:after="40" w:line="230" w:lineRule="exact"/>
+        <w:spacing/>
       </w:pPr>
       <w:r>
-        <w:rPr>
-          <w:sz w:val="19"/>
-        </w:rPr>
-        <w:t>OSINT Fraud Network Investigation — Independent</w:t>
+        <w:rPr/>
+        <w:t>Fakeboot: Storefront Impersonation OSINT | Independent</w:t>
       </w:r>
     </w:p>
     <w:p>
       <w:pPr>
-        <w:spacing w:before="0" w:after="20" w:line="220" w:lineRule="exact"/>
+        <w:spacing/>
       </w:pPr>
       <w:r>
-        <w:rPr>
-          <w:sz w:val="19"/>
-        </w:rPr>
+        <w:rPr/>
         <w:t>September 2026</w:t>
       </w:r>
     </w:p>
     <w:p>
       <w:pPr>
         <w:pStyle w:val="ListBullet"/>
-        <w:spacing w:before="0" w:after="20" w:line="230" w:lineRule="exact"/>
+        <w:spacing w:after="30"/>
+        <w:ind w:left="288" w:hanging="187"/>
       </w:pPr>
       <w:r>
-        <w:rPr>
-          <w:sz w:val="19"/>
-        </w:rPr>
-        <w:t>Identified a network of 14 fraudulent websites and 8 payment processors impersonating real small businesses.</w:t>
+        <w:rPr/>
+        <w:t>Mapped 14 suspected impersonation storefront domains to eight distinct checkout domains using public web and DNS evidence; published the mapping at fakeboot.paulromeo.net.</w:t>
       </w:r>
     </w:p>
     <w:p>
       <w:pPr>
         <w:pStyle w:val="ListBullet"/>
-        <w:spacing w:before="0" w:after="20" w:line="230" w:lineRule="exact"/>
+        <w:spacing w:after="30"/>
+        <w:ind w:left="288" w:hanging="187"/>
       </w:pPr>
       <w:r>
-        <w:rPr>
-          <w:sz w:val="19"/>
-        </w:rPr>
-        <w:t>Traced the operation to a single threat actor using WHOIS data, Burp Suite, DNS analysis, and a shared admin handle found in page source.</w:t>
+        <w:rPr/>
+        <w:t>Compared checkout routing and shared page-source fingerprints suggesting a connected operation; no individual operator was identified.</w:t>
       </w:r>
     </w:p>
     <w:p>
       <w:pPr>
         <w:pStyle w:val="ListBullet"/>
-        <w:spacing w:before="0" w:after="20" w:line="230" w:lineRule="exact"/>
+        <w:spacing w:after="30"/>
+        <w:ind w:left="288" w:hanging="187"/>
       </w:pPr>
       <w:r>
-        <w:rPr>
-          <w:sz w:val="19"/>
-        </w:rPr>
-        <w:t>Reported the full network to registrars, the FTC (confirmed, control on file), and Google Ads/Maps with evidence; corrections filed and takedowns in progress. Public case file: fakeboot.paulromeo.net.</w:t>
+        <w:rPr/>
+        <w:t>Reported suspected impersonation concerns to registrars and platforms, documenting the submissions in the public case file.</w:t>
       </w:r>
     </w:p>
     <w:p>
       <w:pPr>
         <w:pStyle w:val="SectionHeader"/>
-        <w:spacing w:before="120" w:after="40" w:line="260" w:lineRule="exact"/>
+        <w:keepNext/>
+        <w:spacing w:before="120" w:after="50"/>
+        <w:pBdr>
+          <w:bottom w:val="single" w:sz="6" w:space="2" w:color="B0B7C3"/>
+        </w:pBdr>
       </w:pPr>
       <w:r>
-        <w:rPr>
-          <w:sz w:val="22"/>
-        </w:rPr>
+        <w:rPr/>
         <w:t>EDUCATION</w:t>
       </w:r>
     </w:p>
     <w:p>
       <w:pPr>
         <w:pStyle w:val="Body"/>
-        <w:spacing w:before="0" w:after="40" w:line="230" w:lineRule="exact"/>
+        <w:spacing w:after="50"/>
       </w:pPr>
       <w:r>
         <w:rPr>
           <w:b/>
-          <w:sz w:val="19"/>
         </w:rPr>
         <w:t>B.S. Cybersecurity &amp; Information Assurance</w:t>
       </w:r>
       <w:r>
-        <w:rPr>
-          <w:sz w:val="19"/>
-        </w:rPr>
-        <w:t xml:space="preserve"> — Western Governors University, August 2026</w:t>
+        <w:rPr/>
+        <w:t xml:space="preserve"> | Western Governors University, August 2026</w:t>
       </w:r>
     </w:p>
     <w:sectPr>
+      <w:headerReference w:type="default" r:id="rId9"/>
+      <w:footerReference w:type="default" r:id="rId10"/>
+      <w:headerReference w:type="first" r:id="rId11"/>
+      <w:footerReference w:type="first" r:id="rId12"/>
+      <w:headerReference w:type="even" r:id="rId13"/>
+      <w:footerReference w:type="even" r:id="rId14"/>
       <w:pgSz w:w="12240" w:h="15840"/>
-      <w:pgMar w:top="792" w:right="792" w:bottom="720" w:left="792" w:header="720" w:footer="720" w:gutter="0"/>
+      <w:pgMar w:top="648" w:right="720" w:bottom="648" w:left="720" w:header="720" w:footer="720" w:gutter="0"/>
       <w:cols w:space="720"/>
       <w:docGrid w:linePitch="360"/>
     </w:sectPr>
   </w:body>
 </w:document>
+</file>
+
+<file path=word/footer1.xml><?xml version="1.0" encoding="utf-8"?>
+<w:ftr xmlns:m="http://schemas.openxmlformats.org/officeDocument/2006/math" xmlns:mc="http://schemas.openxmlformats.org/markup-compatibility/2006" xmlns:mo="http://schemas.microsoft.com/office/mac/office/2008/main" xmlns:mv="urn:schemas-microsoft-com:mac:vml" xmlns:o="urn:schemas-microsoft-com:office:office" xmlns:r="http://schemas.openxmlformats.org/officeDocument/2006/relationships" xmlns:v="urn:schemas-microsoft-com:vml" xmlns:w10="urn:schemas-microsoft-com:office:word" xmlns:w14="http://schemas.microsoft.com/office/word/2010/wordml" xmlns:w="http://schemas.openxmlformats.org/wordprocessingml/2006/main" xmlns:wne="http://schemas.microsoft.com/office/word/2006/wordml" xmlns:wp14="http://schemas.microsoft.com/office/word/2010/wordprocessingDrawing" xmlns:wp="http://schemas.openxmlformats.org/drawingml/2006/wordprocessingDrawing" xmlns:wpc="http://schemas.microsoft.com/office/word/2010/wordprocessingCanvas" xmlns:wpg="http://schemas.microsoft.com/office/word/2010/wordprocessingGroup" xmlns:wpi="http://schemas.microsoft.com/office/word/2010/wordprocessingInk" xmlns:wps="http://schemas.microsoft.com/office/word/2010/wordprocessingShape" mc:Ignorable="w14 wp14">
+  <w:p>
+    <w:pPr>
+      <w:pStyle w:val="Footer"/>
+    </w:pPr>
+  </w:p>
+</w:ftr>
+</file>
+
+<file path=word/footer2.xml><?xml version="1.0" encoding="utf-8"?>
+<w:ftr xmlns:m="http://schemas.openxmlformats.org/officeDocument/2006/math" xmlns:mc="http://schemas.openxmlformats.org/markup-compatibility/2006" xmlns:mo="http://schemas.microsoft.com/office/mac/office/2008/main" xmlns:mv="urn:schemas-microsoft-com:mac:vml" xmlns:o="urn:schemas-microsoft-com:office:office" xmlns:r="http://schemas.openxmlformats.org/officeDocument/2006/relationships" xmlns:v="urn:schemas-microsoft-com:vml" xmlns:w10="urn:schemas-microsoft-com:office:word" xmlns:w14="http://schemas.microsoft.com/office/word/2010/wordml" xmlns:w="http://schemas.openxmlformats.org/wordprocessingml/2006/main" xmlns:wne="http://schemas.microsoft.com/office/word/2006/wordml" xmlns:wp14="http://schemas.microsoft.com/office/word/2010/wordprocessingDrawing" xmlns:wp="http://schemas.openxmlformats.org/drawingml/2006/wordprocessingDrawing" xmlns:wpc="http://schemas.microsoft.com/office/word/2010/wordprocessingCanvas" xmlns:wpg="http://schemas.microsoft.com/office/word/2010/wordprocessingGroup" xmlns:wpi="http://schemas.microsoft.com/office/word/2010/wordprocessingInk" xmlns:wps="http://schemas.microsoft.com/office/word/2010/wordprocessingShape" mc:Ignorable="w14 wp14">
+  <w:p>
+    <w:pPr>
+      <w:pStyle w:val="Footer"/>
+    </w:pPr>
+  </w:p>
+</w:ftr>
+</file>
+
+<file path=word/footer3.xml><?xml version="1.0" encoding="utf-8"?>
+<w:ftr xmlns:m="http://schemas.openxmlformats.org/officeDocument/2006/math" xmlns:mc="http://schemas.openxmlformats.org/markup-compatibility/2006" xmlns:mo="http://schemas.microsoft.com/office/mac/office/2008/main" xmlns:mv="urn:schemas-microsoft-com:mac:vml" xmlns:o="urn:schemas-microsoft-com:office:office" xmlns:r="http://schemas.openxmlformats.org/officeDocument/2006/relationships" xmlns:v="urn:schemas-microsoft-com:vml" xmlns:w10="urn:schemas-microsoft-com:office:word" xmlns:w14="http://schemas.microsoft.com/office/word/2010/wordml" xmlns:w="http://schemas.openxmlformats.org/wordprocessingml/2006/main" xmlns:wne="http://schemas.microsoft.com/office/word/2006/wordml" xmlns:wp14="http://schemas.microsoft.com/office/word/2010/wordprocessingDrawing" xmlns:wp="http://schemas.openxmlformats.org/drawingml/2006/wordprocessingDrawing" xmlns:wpc="http://schemas.microsoft.com/office/word/2010/wordprocessingCanvas" xmlns:wpg="http://schemas.microsoft.com/office/word/2010/wordprocessingGroup" xmlns:wpi="http://schemas.microsoft.com/office/word/2010/wordprocessingInk" xmlns:wps="http://schemas.microsoft.com/office/word/2010/wordprocessingShape" mc:Ignorable="w14 wp14">
+  <w:p>
+    <w:pPr>
+      <w:pStyle w:val="Footer"/>
+    </w:pPr>
+  </w:p>
+</w:ftr>
+</file>
+
+<file path=word/header1.xml><?xml version="1.0" encoding="utf-8"?>
+<w:hdr xmlns:m="http://schemas.openxmlformats.org/officeDocument/2006/math" xmlns:mc="http://schemas.openxmlformats.org/markup-compatibility/2006" xmlns:mo="http://schemas.microsoft.com/office/mac/office/2008/main" xmlns:mv="urn:schemas-microsoft-com:mac:vml" xmlns:o="urn:schemas-microsoft-com:office:office" xmlns:r="http://schemas.openxmlformats.org/officeDocument/2006/relationships" xmlns:v="urn:schemas-microsoft-com:vml" xmlns:w10="urn:schemas-microsoft-com:office:word" xmlns:w14="http://schemas.microsoft.com/office/word/2010/wordml" xmlns:w="http://schemas.openxmlformats.org/wordprocessingml/2006/main" xmlns:wne="http://schemas.microsoft.com/office/word/2006/wordml" xmlns:wp14="http://schemas.microsoft.com/office/word/2010/wordprocessingDrawing" xmlns:wp="http://schemas.openxmlformats.org/drawingml/2006/wordprocessingDrawing" xmlns:wpc="http://schemas.microsoft.com/office/word/2010/wordprocessingCanvas" xmlns:wpg="http://schemas.microsoft.com/office/word/2010/wordprocessingGroup" xmlns:wpi="http://schemas.microsoft.com/office/word/2010/wordprocessingInk" xmlns:wps="http://schemas.microsoft.com/office/word/2010/wordprocessingShape" mc:Ignorable="w14 wp14">
+  <w:p>
+    <w:pPr>
+      <w:pStyle w:val="Header"/>
+    </w:pPr>
+  </w:p>
+</w:hdr>
+</file>
+
+<file path=word/header2.xml><?xml version="1.0" encoding="utf-8"?>
+<w:hdr xmlns:m="http://schemas.openxmlformats.org/officeDocument/2006/math" xmlns:mc="http://schemas.openxmlformats.org/markup-compatibility/2006" xmlns:mo="http://schemas.microsoft.com/office/mac/office/2008/main" xmlns:mv="urn:schemas-microsoft-com:mac:vml" xmlns:o="urn:schemas-microsoft-com:office:office" xmlns:r="http://schemas.openxmlformats.org/officeDocument/2006/relationships" xmlns:v="urn:schemas-microsoft-com:vml" xmlns:w10="urn:schemas-microsoft-com:office:word" xmlns:w14="http://schemas.microsoft.com/office/word/2010/wordml" xmlns:w="http://schemas.openxmlformats.org/wordprocessingml/2006/main" xmlns:wne="http://schemas.microsoft.com/office/word/2006/wordml" xmlns:wp14="http://schemas.microsoft.com/office/word/2010/wordprocessingDrawing" xmlns:wp="http://schemas.openxmlformats.org/drawingml/2006/wordprocessingDrawing" xmlns:wpc="http://schemas.microsoft.com/office/word/2010/wordprocessingCanvas" xmlns:wpg="http://schemas.microsoft.com/office/word/2010/wordprocessingGroup" xmlns:wpi="http://schemas.microsoft.com/office/word/2010/wordprocessingInk" xmlns:wps="http://schemas.microsoft.com/office/word/2010/wordprocessingShape" mc:Ignorable="w14 wp14">
+  <w:p>
+    <w:pPr>
+      <w:pStyle w:val="Header"/>
+    </w:pPr>
+  </w:p>
+</w:hdr>
+</file>
+
+<file path=word/header3.xml><?xml version="1.0" encoding="utf-8"?>
+<w:hdr xmlns:m="http://schemas.openxmlformats.org/officeDocument/2006/math" xmlns:mc="http://schemas.openxmlformats.org/markup-compatibility/2006" xmlns:mo="http://schemas.microsoft.com/office/mac/office/2008/main" xmlns:mv="urn:schemas-microsoft-com:mac:vml" xmlns:o="urn:schemas-microsoft-com:office:office" xmlns:r="http://schemas.openxmlformats.org/officeDocument/2006/relationships" xmlns:v="urn:schemas-microsoft-com:vml" xmlns:w10="urn:schemas-microsoft-com:office:word" xmlns:w14="http://schemas.microsoft.com/office/word/2010/wordml" xmlns:w="http://schemas.openxmlformats.org/wordprocessingml/2006/main" xmlns:wne="http://schemas.microsoft.com/office/word/2006/wordml" xmlns:wp14="http://schemas.microsoft.com/office/word/2010/wordprocessingDrawing" xmlns:wp="http://schemas.openxmlformats.org/drawingml/2006/wordprocessingDrawing" xmlns:wpc="http://schemas.microsoft.com/office/word/2010/wordprocessingCanvas" xmlns:wpg="http://schemas.microsoft.com/office/word/2010/wordprocessingGroup" xmlns:wpi="http://schemas.microsoft.com/office/word/2010/wordprocessingInk" xmlns:wps="http://schemas.microsoft.com/office/word/2010/wordprocessingShape" mc:Ignorable="w14 wp14">
+  <w:p>
+    <w:pPr>
+      <w:pStyle w:val="Header"/>
+    </w:pPr>
+  </w:p>
+</w:hdr>
 </file>
 
 <file path=word/numbering.xml><?xml version="1.0" encoding="utf-8"?>
@@ -945,6 +961,10 @@
     <w:pPr>
       <w:spacing w:before="0" w:after="0" w:line="240" w:lineRule="auto"/>
     </w:pPr>
+    <w:rPr>
+      <w:rFonts w:ascii="Calibri" w:hAnsi="Calibri" w:cs="Calibri"/>
+      <w:sz w:val="19"/>
+    </w:rPr>
   </w:style>
   <w:style w:type="paragraph" w:styleId="Header">
     <w:name w:val="header"/>
@@ -1476,6 +1496,11 @@
       <w:spacing w:before="0" w:after="0" w:line="240" w:lineRule="auto"/>
       <w:contextualSpacing/>
     </w:pPr>
+    <w:rPr>
+      <w:rFonts w:ascii="Calibri" w:hAnsi="Calibri" w:cs="Calibri"/>
+      <w:color w:val="19202A"/>
+      <w:sz w:val="19"/>
+    </w:rPr>
   </w:style>
   <w:style w:type="paragraph" w:styleId="ListBullet2">
     <w:name w:val="List Bullet 2"/>
@@ -12634,10 +12659,10 @@
     <w:name w:val="NameTitle"/>
     <w:basedOn w:val="Normal"/>
     <w:rPr>
-      <w:rFonts w:ascii="Helvetica" w:hAnsi="Helvetica"/>
+      <w:rFonts w:ascii="Calibri" w:hAnsi="Calibri" w:cs="Calibri"/>
       <w:b/>
       <w:color w:val="19202A"/>
-      <w:sz w:val="40"/>
+      <w:sz w:val="38"/>
     </w:rPr>
   </w:style>
   <w:style w:type="paragraph" w:customStyle="1" w:styleId="ContactLine">
@@ -12647,11 +12672,11 @@
       <w:spacing w:before="0" w:after="0" w:line="240" w:lineRule="auto"/>
     </w:pPr>
     <w:rPr>
-      <w:rFonts w:ascii="Helvetica" w:hAnsi="Helvetica"/>
+      <w:rFonts w:ascii="Calibri" w:hAnsi="Calibri" w:cs="Calibri"/>
       <w:b w:val="0"/>
       <w:i w:val="0"/>
-      <w:color w:val="464E5A"/>
-      <w:sz w:val="19"/>
+      <w:color w:val="4A5568"/>
+      <w:sz w:val="18"/>
     </w:rPr>
   </w:style>
   <w:style w:type="paragraph" w:customStyle="1" w:styleId="SectionHeader">
@@ -12661,25 +12686,25 @@
       <w:spacing w:before="0" w:after="0" w:line="240" w:lineRule="auto"/>
     </w:pPr>
     <w:rPr>
-      <w:rFonts w:ascii="Helvetica" w:hAnsi="Helvetica"/>
-      <w:b/>
-      <w:color w:val="1E4678"/>
-      <w:sz w:val="22"/>
-    </w:rPr>
-  </w:style>
-  <w:style w:type="paragraph" w:customStyle="1" w:styleId="JobTitle">
-    <w:name w:val="JobTitle"/>
-    <w:basedOn w:val="Normal"/>
-    <w:pPr>
-      <w:spacing w:before="0" w:after="0" w:line="240" w:lineRule="auto"/>
-    </w:pPr>
-    <w:rPr>
-      <w:rFonts w:ascii="Helvetica" w:hAnsi="Helvetica"/>
+      <w:rFonts w:ascii="Calibri" w:hAnsi="Calibri" w:cs="Calibri"/>
       <w:b/>
       <w:color w:val="19202A"/>
       <w:sz w:val="21"/>
     </w:rPr>
   </w:style>
+  <w:style w:type="paragraph" w:customStyle="1" w:styleId="JobTitle">
+    <w:name w:val="JobTitle"/>
+    <w:basedOn w:val="Normal"/>
+    <w:pPr>
+      <w:spacing w:before="0" w:after="0" w:line="240" w:lineRule="auto"/>
+    </w:pPr>
+    <w:rPr>
+      <w:rFonts w:ascii="Calibri" w:hAnsi="Calibri" w:cs="Calibri"/>
+      <w:b/>
+      <w:color w:val="19202A"/>
+      <w:sz w:val="20"/>
+    </w:rPr>
+  </w:style>
   <w:style w:type="paragraph" w:customStyle="1" w:styleId="JobMeta">
     <w:name w:val="JobMeta"/>
     <w:basedOn w:val="Normal"/>
@@ -12687,11 +12712,11 @@
       <w:spacing w:before="0" w:after="0" w:line="240" w:lineRule="auto"/>
     </w:pPr>
     <w:rPr>
-      <w:rFonts w:ascii="Helvetica" w:hAnsi="Helvetica"/>
+      <w:rFonts w:ascii="Calibri" w:hAnsi="Calibri" w:cs="Calibri"/>
       <w:b w:val="0"/>
       <w:i/>
-      <w:color w:val="5A626E"/>
-      <w:sz w:val="19"/>
+      <w:color w:val="4A5568"/>
+      <w:sz w:val="18"/>
     </w:rPr>
   </w:style>
   <w:style w:type="paragraph" w:customStyle="1" w:styleId="Body">
@@ -12701,7 +12726,7 @@
       <w:spacing w:before="0" w:after="0" w:line="240" w:lineRule="auto"/>
     </w:pPr>
     <w:rPr>
-      <w:rFonts w:ascii="Helvetica" w:hAnsi="Helvetica"/>
+      <w:rFonts w:ascii="Calibri" w:hAnsi="Calibri" w:cs="Calibri"/>
       <w:b w:val="0"/>
       <w:color w:val="19202A"/>
       <w:sz w:val="19"/>

</xml_diff>